<commit_message>
Fix typos in Meeting in a Pocket and regenerate readings page
Spelling (true, adjust, Vanity, Spirituality, that), stray punctuation
in Just for Today and Step 1, consistent capitals in the ABCs of
Meeting Topics, and "(cont.)" on continued headings.

Co-Authored-By: Claude Opus 5.5 <noreply@anthropic.com>
</commit_message>
<xml_diff>
--- a/public/files/Meeting-in-a-Pocket-3x5.docx
+++ b/public/files/Meeting-in-a-Pocket-3x5.docx
@@ -557,7 +557,7 @@
         <w:rPr>
           <w:rtl w:val="0"/>
         </w:rPr>
-        <w:t xml:space="preserve">1. We admitted we were powerless over alcohol - that our lives had become unmanageable.</w:t>
+        <w:t xml:space="preserve">1. We admitted we were powerless over alcohol—that our lives had become unmanageable.</w:t>
       </w:r>
       <w:r>
         <w:rPr>
@@ -1057,7 +1057,7 @@
           <w:szCs w:val="36"/>
           <w:rtl w:val="0"/>
         </w:rPr>
-        <w:t xml:space="preserve">How It Works (con't)</w:t>
+        <w:t xml:space="preserve">How It Works (cont.)</w:t>
       </w:r>
       <w:r>
         <w:rPr>
@@ -1584,7 +1584,7 @@
         <w:rPr>
           <w:rtl w:val="0"/>
         </w:rPr>
-        <w:t xml:space="preserve">The Twelve Traditions (cont)</w:t>
+        <w:t xml:space="preserve">The Twelve Traditions (cont.)</w:t>
       </w:r>
       <w:r>
         <w:rPr>
@@ -3491,7 +3491,7 @@
         <w:rPr>
           <w:rtl w:val="0"/>
         </w:rPr>
-        <w:t xml:space="preserve"> I will be happy. This assumes to be tru what Abraham Lincoln said that, “most folks are as happy as they make up their minds to be.”</w:t>
+        <w:t xml:space="preserve"> I will be happy. This assumes to be true what Abraham Lincoln said that, “most folks are as happy as they make up their minds to be.”</w:t>
       </w:r>
     </w:p>
     <w:p>
@@ -3511,7 +3511,7 @@
         <w:rPr>
           <w:rtl w:val="0"/>
         </w:rPr>
-        <w:t xml:space="preserve"> I will adjust myself to what is, and not try to just everything to my own desires. I will take my “luck” as it comes, and fit myself to it. </w:t>
+        <w:t xml:space="preserve"> I will adjust myself to what is, and not try to adjust everything to my own desires. I will take my “luck” as it comes, and fit myself to it. </w:t>
       </w:r>
     </w:p>
     <w:p>
@@ -3531,7 +3531,7 @@
         <w:rPr>
           <w:rtl w:val="0"/>
         </w:rPr>
-        <w:t xml:space="preserve"> I will try to strengthen my mind. I will study. I will learn something useful. I will not be a mental; loafer. I will read something that requires effort, thought and concentration. </w:t>
+        <w:t xml:space="preserve"> I will try to strengthen my mind. I will study. I will learn something useful. I will not be a mental loafer. I will read something that requires effort, thought and concentration. </w:t>
       </w:r>
     </w:p>
     <w:p>
@@ -3551,7 +3551,7 @@
         <w:rPr>
           <w:rtl w:val="0"/>
         </w:rPr>
-        <w:t xml:space="preserve"> I will exercise my soul in three ways: I will do somebody a good turn, and not get found out; if anybody knows of it , it will not count. I will do at least two things I don’t want to do, - just for exercise. I will not show anyone that my feelings are hurt: they may be hurt but today I will not show it. </w:t>
+        <w:t xml:space="preserve"> I will exercise my soul in three ways: I will do somebody a good turn, and not get found out; if anybody knows of it, it will not count. I will do at least two things I don’t want to do—just for exercise. I will not show anyone that my feelings are hurt: they may be hurt but today I will not show it. </w:t>
       </w:r>
     </w:p>
     <w:p>
@@ -3722,7 +3722,7 @@
           <w:vertAlign w:val="baseline"/>
           <w:rtl w:val="0"/>
         </w:rPr>
-        <w:t xml:space="preserve">Acceptance, amends, Anonymity</w:t>
+        <w:t xml:space="preserve">Acceptance, Amends, Anonymity</w:t>
       </w:r>
     </w:p>
     <w:p>
@@ -3893,7 +3893,7 @@
           <w:vertAlign w:val="baseline"/>
           <w:rtl w:val="0"/>
         </w:rPr>
-        <w:t xml:space="preserve">Desire, decisions, Depression</w:t>
+        <w:t xml:space="preserve">Desire, Decisions, Depression</w:t>
       </w:r>
     </w:p>
     <w:p>
@@ -4007,7 +4007,7 @@
           <w:vertAlign w:val="baseline"/>
           <w:rtl w:val="0"/>
         </w:rPr>
-        <w:t xml:space="preserve">Faith, Fear, Fellowship, Fatigue.</w:t>
+        <w:t xml:space="preserve">Faith, Fear, Fellowship, Fatigue</w:t>
       </w:r>
     </w:p>
     <w:p>
@@ -4121,7 +4121,7 @@
           <w:vertAlign w:val="baseline"/>
           <w:rtl w:val="0"/>
         </w:rPr>
-        <w:t xml:space="preserve">Humility, Hope, Honesty, happiness</w:t>
+        <w:t xml:space="preserve">Humility, Hope, Honesty, Happiness</w:t>
       </w:r>
     </w:p>
     <w:p>
@@ -4178,7 +4178,7 @@
           <w:vertAlign w:val="baseline"/>
           <w:rtl w:val="0"/>
         </w:rPr>
-        <w:t xml:space="preserve">Inferiority, illness, Immaturity, Inside</w:t>
+        <w:t xml:space="preserve">Inferiority, Illness, Immaturity, Inside</w:t>
       </w:r>
     </w:p>
     <w:p>
@@ -4634,7 +4634,7 @@
           <w:vertAlign w:val="baseline"/>
           <w:rtl w:val="0"/>
         </w:rPr>
-        <w:t xml:space="preserve">Quality vrs Quantity, Quiet Time</w:t>
+        <w:t xml:space="preserve">Quality vs. Quantity, Quiet Time</w:t>
       </w:r>
     </w:p>
     <w:p>
@@ -4748,7 +4748,7 @@
           <w:vertAlign w:val="baseline"/>
           <w:rtl w:val="0"/>
         </w:rPr>
-        <w:t xml:space="preserve">Surrender, Serenity, Spirituaility</w:t>
+        <w:t xml:space="preserve">Surrender, Serenity, Spirituality</w:t>
       </w:r>
     </w:p>
     <w:p>
@@ -4919,7 +4919,7 @@
           <w:vertAlign w:val="baseline"/>
           <w:rtl w:val="0"/>
         </w:rPr>
-        <w:t xml:space="preserve">Vandity, Values, Virtues, Vulgarity</w:t>
+        <w:t xml:space="preserve">Vanity, Values, Virtues, Vulgarity</w:t>
       </w:r>
     </w:p>
     <w:p>
@@ -5073,7 +5073,7 @@
         <w:rPr>
           <w:rtl w:val="0"/>
         </w:rPr>
-        <w:t xml:space="preserve">Acceptance is the answer to all my problems today. When I am disturbed, it is because I find some person, place, thing, or situation—some fact of my life —unacceptable to me, and I can find no serenity until I accept that person, place, thing, or situation as being exactly the way it is supposed to be at this moment. Nothing, absolutely nothing, happens in God’s world by mistake.</w:t>
+        <w:t xml:space="preserve">Acceptance is the answer to all my problems today. When I am disturbed, it is because I find some person, place, thing, or situation—some fact of my life—unacceptable to me, and I can find no serenity until I accept that person, place, thing, or situation as being exactly the way it is supposed to be at this moment. Nothing, absolutely nothing, happens in God’s world by mistake.</w:t>
       </w:r>
     </w:p>
     <w:p>
@@ -5165,7 +5165,7 @@
         <w:rPr>
           <w:rtl w:val="0"/>
         </w:rPr>
-        <w:t xml:space="preserve">This was our course: We realized tha the people who wronged us were perhaps spiritually sick. </w:t>
+        <w:t xml:space="preserve">This was our course: We realized that the people who wronged us were perhaps spiritually sick. </w:t>
       </w:r>
     </w:p>
     <w:p>
@@ -5216,7 +5216,7 @@
         <w:rPr>
           <w:rtl w:val="0"/>
         </w:rPr>
-        <w:t xml:space="preserve">acceptance is the answer to all my problems today. When I am disturbed, it is because I find some person, place, thing, or situation—some fact of my life —unacceptable to me, and I can find no serenity until I accept that person, place, thing, or situation as being exactly the way it is supposed to be at this moment. Nothing, absolutely nothing, happens in God’s world by mistake.</w:t>
+        <w:t xml:space="preserve">acceptance is the answer to all my problems today. When I am disturbed, it is because I find some person, place, thing, or situation—some fact of my life—unacceptable to me, and I can find no serenity until I accept that person, place, thing, or situation as being exactly the way it is supposed to be at this moment. Nothing, absolutely nothing, happens in God’s world by mistake.</w:t>
       </w:r>
     </w:p>
     <w:p>

</xml_diff>